<commit_message>
Changed the stepsize adjustment once the particle enters 0.03au sphere to r=r/3 instead of making it 1/100 day. Added that GM=1 in the integrations in the readme
</commit_message>
<xml_diff>
--- a/readme.docx
+++ b/readme.docx
@@ -722,6 +722,32 @@
           <w:szCs w:val="24"/>
         </w:rPr>
         <w:t>All coordinates are heliocentric.</w:t>
+      </w:r>
+    </w:p>
+    <w:p>
+      <w:pPr>
+        <w:spacing w:before="100" w:beforeAutospacing="1" w:after="100" w:afterAutospacing="1" w:line="240" w:lineRule="auto"/>
+        <w:rPr>
+          <w:rFonts w:ascii="Times New Roman" w:eastAsia="Times New Roman" w:hAnsi="Times New Roman" w:cs="Times New Roman"/>
+          <w:sz w:val="24"/>
+          <w:szCs w:val="24"/>
+        </w:rPr>
+      </w:pPr>
+      <w:r>
+        <w:rPr>
+          <w:rFonts w:ascii="Times New Roman" w:eastAsia="Times New Roman" w:hAnsi="Times New Roman" w:cs="Times New Roman"/>
+          <w:sz w:val="24"/>
+          <w:szCs w:val="24"/>
+        </w:rPr>
+        <w:t xml:space="preserve">In the integrations it is assumed that GM=1. </w:t>
+      </w:r>
+      <w:r>
+        <w:rPr>
+          <w:rFonts w:ascii="Times New Roman" w:eastAsia="Times New Roman" w:hAnsi="Times New Roman" w:cs="Times New Roman"/>
+          <w:sz w:val="24"/>
+          <w:szCs w:val="24"/>
+        </w:rPr>
+        <w:t>The mass of the central body must be 1, and the other bodies the percentage of the central body.</w:t>
       </w:r>
     </w:p>
     <w:p>
@@ -1263,6 +1289,7 @@
           <w:sz w:val="24"/>
           <w:szCs w:val="24"/>
         </w:rPr>
+        <w:lastRenderedPageBreak/>
         <w:t>perturb all test particles,</w:t>
       </w:r>
     </w:p>
@@ -1303,7 +1330,6 @@
           <w:sz w:val="24"/>
           <w:szCs w:val="24"/>
         </w:rPr>
-        <w:lastRenderedPageBreak/>
         <w:t>The ordering of planets in the input file is arbitrary.</w:t>
       </w:r>
     </w:p>
@@ -2068,6 +2094,7 @@
           <w:sz w:val="24"/>
           <w:szCs w:val="24"/>
         </w:rPr>
+        <w:lastRenderedPageBreak/>
         <w:t>This file controls the integration.</w:t>
       </w:r>
     </w:p>
@@ -2122,7 +2149,6 @@
           <w:sz w:val="20"/>
           <w:szCs w:val="20"/>
         </w:rPr>
-        <w:lastRenderedPageBreak/>
         <w:t xml:space="preserve">8               </w:t>
       </w:r>
     </w:p>
@@ -3960,6 +3986,7 @@
           <w:sz w:val="24"/>
           <w:szCs w:val="24"/>
         </w:rPr>
+        <w:lastRenderedPageBreak/>
         <w:t>Units:</w:t>
       </w:r>
     </w:p>
@@ -4026,7 +4053,6 @@
           <w:sz w:val="24"/>
           <w:szCs w:val="24"/>
         </w:rPr>
-        <w:lastRenderedPageBreak/>
         <w:t>velocity in AU/day</w:t>
       </w:r>
     </w:p>
@@ -4639,6 +4665,7 @@
           <w:sz w:val="24"/>
           <w:szCs w:val="24"/>
         </w:rPr>
+        <w:lastRenderedPageBreak/>
         <w:t>integration accuracy is automatically increased,</w:t>
       </w:r>
     </w:p>
@@ -4704,7 +4731,6 @@
           <w:sz w:val="36"/>
           <w:szCs w:val="36"/>
         </w:rPr>
-        <w:lastRenderedPageBreak/>
         <w:t>5. Particle Input File</w:t>
       </w:r>
     </w:p>
@@ -5311,6 +5337,7 @@
           <w:sz w:val="20"/>
           <w:szCs w:val="20"/>
         </w:rPr>
+        <w:lastRenderedPageBreak/>
         <w:t>elements_char = cartesian</w:t>
       </w:r>
     </w:p>
@@ -5383,7 +5410,6 @@
           <w:sz w:val="24"/>
           <w:szCs w:val="24"/>
         </w:rPr>
-        <w:lastRenderedPageBreak/>
         <w:t>with</w:t>
       </w:r>
     </w:p>
@@ -6181,6 +6207,7 @@
           <w:sz w:val="20"/>
           <w:szCs w:val="20"/>
         </w:rPr>
+        <w:lastRenderedPageBreak/>
         <w:t>lobbie_integration</w:t>
       </w:r>
     </w:p>
@@ -6253,7 +6280,6 @@
           <w:sz w:val="24"/>
           <w:szCs w:val="24"/>
         </w:rPr>
-        <w:lastRenderedPageBreak/>
         <w:t>The program will ask for the particle file name.</w:t>
       </w:r>
     </w:p>
@@ -6865,6 +6891,7 @@
           <w:sz w:val="20"/>
           <w:szCs w:val="20"/>
         </w:rPr>
+        <w:lastRenderedPageBreak/>
         <w:t>a,e,i,Ω,ω,M</w:t>
       </w:r>
     </w:p>
@@ -6951,7 +6978,6 @@
                 <w:sz w:val="24"/>
                 <w:szCs w:val="24"/>
               </w:rPr>
-              <w:lastRenderedPageBreak/>
               <w:t>Quantity</w:t>
             </w:r>
           </w:p>
@@ -7649,6 +7675,7 @@
           <w:sz w:val="24"/>
           <w:szCs w:val="24"/>
         </w:rPr>
+        <w:lastRenderedPageBreak/>
         <w:t>When particles enter a planetary sphere of influence:</w:t>
       </w:r>
     </w:p>
@@ -7711,7 +7738,6 @@
           <w:sz w:val="24"/>
           <w:szCs w:val="24"/>
         </w:rPr>
-        <w:lastRenderedPageBreak/>
         <w:pict w14:anchorId="23CDC31E">
           <v:rect id="_x0000_i1043" style="width:0;height:1.5pt" o:hralign="center" o:hrstd="t" o:hr="t" fillcolor="#a0a0a0" stroked="f"/>
         </w:pict>
@@ -8458,6 +8484,7 @@
           <w:sz w:val="20"/>
           <w:szCs w:val="20"/>
         </w:rPr>
+        <w:lastRenderedPageBreak/>
         <w:t>if_sun_radiation_press_include</w:t>
       </w:r>
     </w:p>
@@ -8530,7 +8557,6 @@
           <w:sz w:val="24"/>
           <w:szCs w:val="24"/>
         </w:rPr>
-        <w:lastRenderedPageBreak/>
         <w:t>The present version of Lobbie should therefore be regarded as a purely gravitational integrator.</w:t>
       </w:r>
     </w:p>

</xml_diff>